<commit_message>
Terceira leva de citações: Álvarez et al. (2023) e Bibi e Chandorkar (2025)
Conteúdo conferido no resumo dos autores (versões abertas); dados pelo
DOI. Dasilas e Rigani (2024) fica de fora, sem resumo verificável.
Artigo v4 regenerado: 596 células sem divergência, estrutura sem
problemas, 60 referências, 13 de 2020 em diante.

Co-Authored-By: Claude Opus 5.5 <noreply@anthropic.com>
Claude-Session: https://claude.ai/code/session_01V4LwoZDLWB9PeJtPghPCix
</commit_message>
<xml_diff>
--- a/projeto/envio/Artigo_Fragilidade_Financeira_v4.docx
+++ b/projeto/envio/Artigo_Fragilidade_Financeira_v4.docx
@@ -2408,7 +2408,7 @@
           <w:sz w:val="24"/>
           <w:szCs w:val="24"/>
         </w:rPr>
-        <w:t xml:space="preserve">Convém antes separar três conceitos que a literatura por vezes trata como equivalentes. Fragilidade financeira é o estado latente de vulnerabilidade estrutural acumulada, que se manifesta na deterioração dos indicadores contábeis sem incapacidade declarada de honrar compromissos. É o objeto de mensuração do indicador sintético. Vulnerabilidade financeira é o estado intermediário, em que a firma já apresenta dificuldades observáveis, como patrimônio líquido negativo, compressão severa de caixa ou renegociação de dívidas, sem default formal. É a variável-alvo dos modelos preditivos. Distress financeiro é o estado realizado, com inadimplência declarada, pedido de recuperação judicial ou violação de covenants sem cura. A orientação para vulnerabilidade, e não para default, é deliberada: a informação preditiva tem maior valor diagnóstico antes que a deterioração se torne irreversível, e a literatura brasileira concentra-se quase inteiramente no terceiro conceito.</w:t>
+        <w:t xml:space="preserve">Convém antes separar três conceitos que a literatura por vezes trata como equivalentes. Fragilidade financeira é o estado latente de vulnerabilidade estrutural acumulada, que se manifesta na deterioração dos indicadores contábeis sem incapacidade declarada de honrar compromissos. É o objeto de mensuração do indicador sintético. Vulnerabilidade financeira é o estado intermediário, em que a firma já apresenta dificuldades observáveis, como patrimônio líquido negativo, compressão severa de caixa ou renegociação de dívidas, sem default formal. É a variável-alvo dos modelos preditivos. Distress financeiro é o estado realizado, com inadimplência declarada, pedido de recuperação judicial ou violação de covenants sem cura. Álvarez, García-Posada e Mayordomo (2023) adotam taxonomia próxima para empresas espanholas: a firma em distress apresenta ao mesmo tempo insolvência de fluxo de caixa e insolvência patrimonial, e a firma zumbi é a firma em distress que recebeu crédito novo. A distinção entre as duas formas de insolvência reaparece, neste trabalho, nas rotas de deterioração por prejuízo operacional e por patrimônio líquido negativo. A orientação para vulnerabilidade, e não para default, é deliberada: a informação preditiva tem maior valor diagnóstico antes que a deterioração se torne irreversível, e a literatura brasileira concentra-se quase inteiramente no terceiro conceito.</w:t>
       </w:r>
     </w:p>
     <w:p>
@@ -2549,7 +2549,7 @@
           <w:sz w:val="24"/>
           <w:szCs w:val="24"/>
         </w:rPr>
-        <w:t xml:space="preserve">Nishi (2019) aplica a taxonomia aos setores não financeiros japoneses e encontra predominância da posição especulativa, com evolução distinta por setor e porte. Novikova e Rozmainsky (2020) acompanham os regimes de financiamento de 42 grandes companhias não financeiras portuguesas entre 2001 e 2017 e documentam a redução da parcela em posição hedge e o aumento dos regimes frágeis antes e durante a Grande Recessão.</w:t>
+        <w:t xml:space="preserve">Nishi (2019) aplica a taxonomia aos setores não financeiros japoneses e encontra predominância da posição especulativa, com evolução distinta por setor e porte. Novikova e Rozmainsky (2020) acompanham os regimes de financiamento de 42 grandes companhias não financeiras portuguesas entre 2001 e 2017 e documentam a redução da parcela em posição hedge e o aumento dos regimes frágeis antes e durante a Grande Recessão. Bibi e Chandorkar (2025) constroem indicadores minskyanos para 59 companhias listadas na bolsa peruana entre 2003 e 2023 e encontram exposições à fragilidade financeira distintas entre setores.</w:t>
       </w:r>
     </w:p>
     <w:p>
@@ -31370,7 +31370,7 @@
           <w:sz w:val="24"/>
           <w:szCs w:val="24"/>
         </w:rPr>
-        <w:t xml:space="preserve">BANERJEE, R.; HOFMANN, B. The rise of zombie firms: causes and consequences. BIS Quarterly Review, p. 67-78, set. 2018.</w:t>
+        <w:t xml:space="preserve">ÁLVAREZ, L.; GARCÍA-POSADA, M.; MAYORDOMO, S. Distressed firms, zombie firms and zombie lending: a taxonomy. Journal of Banking &amp; Finance, v. 149, art. 106762, 2023.</w:t>
       </w:r>
     </w:p>
     <w:p>
@@ -31388,7 +31388,7 @@
           <w:sz w:val="24"/>
           <w:szCs w:val="24"/>
         </w:rPr>
-        <w:t xml:space="preserve">BANERJEE, R.; HOFMANN, B. Corporate zombies: anatomy and life cycle. Economic Policy, v. 37, n. 112, p. 757-803, 2022.</w:t>
+        <w:t xml:space="preserve">BANERJEE, R.; HOFMANN, B. The rise of zombie firms: causes and consequences. BIS Quarterly Review, p. 67-78, set. 2018.</w:t>
       </w:r>
     </w:p>
     <w:p>
@@ -31406,7 +31406,7 @@
           <w:sz w:val="24"/>
           <w:szCs w:val="24"/>
         </w:rPr>
-        <w:t xml:space="preserve">BARBOZA, F.; KIMURA, H.; ALTMAN, E. Machine learning models and bankruptcy prediction. Expert Systems with Applications, v. 83, p. 405-417, 2017.</w:t>
+        <w:t xml:space="preserve">BANERJEE, R.; HOFMANN, B. Corporate zombies: anatomy and life cycle. Economic Policy, v. 37, n. 112, p. 757-803, 2022.</w:t>
       </w:r>
     </w:p>
     <w:p>
@@ -31424,7 +31424,43 @@
           <w:sz w:val="24"/>
           <w:szCs w:val="24"/>
         </w:rPr>
+        <w:t xml:space="preserve">BARBOZA, F.; KIMURA, H.; ALTMAN, E. Machine learning models and bankruptcy prediction. Expert Systems with Applications, v. 83, p. 405-417, 2017.</w:t>
+      </w:r>
+    </w:p>
+    <w:p>
+      <w:pPr>
+        <w:spacing w:after="180" w:before="0" w:line="240"/>
+        <w:jc w:val="left"/>
+      </w:pPr>
+      <w:r>
+        <w:rPr>
+          <w:rFonts w:ascii="Times New Roman" w:cs="Times New Roman" w:eastAsia="Times New Roman" w:hAnsi="Times New Roman"/>
+          <w:b w:val="false"/>
+          <w:bCs w:val="false"/>
+          <w:i w:val="false"/>
+          <w:iCs w:val="false"/>
+          <w:sz w:val="24"/>
+          <w:szCs w:val="24"/>
+        </w:rPr>
         <w:t xml:space="preserve">BARKER, M.; RAYENS, W. Partial least squares for discrimination. Journal of Chemometrics, v. 17, n. 3, p. 166-173, 2003.</w:t>
+      </w:r>
+    </w:p>
+    <w:p>
+      <w:pPr>
+        <w:spacing w:after="180" w:before="0" w:line="240"/>
+        <w:jc w:val="left"/>
+      </w:pPr>
+      <w:r>
+        <w:rPr>
+          <w:rFonts w:ascii="Times New Roman" w:cs="Times New Roman" w:eastAsia="Times New Roman" w:hAnsi="Times New Roman"/>
+          <w:b w:val="false"/>
+          <w:bCs w:val="false"/>
+          <w:i w:val="false"/>
+          <w:iCs w:val="false"/>
+          <w:sz w:val="24"/>
+          <w:szCs w:val="24"/>
+        </w:rPr>
+        <w:t xml:space="preserve">BIBI, S.; CHANDORKAR, P. A. Minsky in Peru: unveiling the hidden financial fragility at a sectoral level. Structural Change and Economic Dynamics, v. 73, p. 77-88, 2025.</w:t>
       </w:r>
     </w:p>
     <w:p>

</xml_diff>

<commit_message>
Corrige sinal de limites de intervalo que passaram de negativos a positivos
O formatador herdava o sinal da célula antiga; na Tabela 12, dois limites
ficaram sem o '+' (0,001 e 0,003). Agora a célula ganha '+' sempre que a
coluna usa sinal explícito e o novo valor é positivo. Só essas duas
células mudam; 596 células sem divergência.

Co-Authored-By: Claude Opus 5.5 <noreply@anthropic.com>
Claude-Session: https://claude.ai/code/session_01V4LwoZDLWB9PeJtPghPCix
</commit_message>
<xml_diff>
--- a/projeto/envio/Artigo_Fragilidade_Financeira_v4.docx
+++ b/projeto/envio/Artigo_Fragilidade_Financeira_v4.docx
@@ -24448,7 +24448,7 @@
                 <w:sz w:val="20"/>
                 <w:szCs w:val="20"/>
               </w:rPr>
-              <w:t xml:space="preserve">[−0,128; 0,001]</w:t>
+              <w:t xml:space="preserve">[−0,128; +0,001]</w:t>
             </w:r>
           </w:p>
         </w:tc>
@@ -24656,7 +24656,7 @@
                 <w:sz w:val="20"/>
                 <w:szCs w:val="20"/>
               </w:rPr>
-              <w:t xml:space="preserve">[0,003; +0,134]</w:t>
+              <w:t xml:space="preserve">[+0,003; +0,134]</w:t>
             </w:r>
           </w:p>
         </w:tc>

</xml_diff>